<commit_message>
Fix report appendix and PDF layout
</commit_message>
<xml_diff>
--- a/submission/forest_query_report.docx
+++ b/submission/forest_query_report.docx
@@ -1311,8 +1311,488 @@
       </w:r>
     </w:p>
     <w:p>
+      <w:pPr>
+        <w:pStyle w:val="NoSpacing"/>
+      </w:pPr>
       <w:r>
-        <w:t>See forest_query_analysis.sql for the full SQL appendix.</w:t>
+        <w:rPr>
+          <w:rFonts w:ascii="Courier New" w:hAnsi="Courier New"/>
+          <w:sz w:val="16"/>
+        </w:rPr>
+        <w:t>-- ForestQuery SQL Appendix</w:t>
+        <w:br/>
+        <w:t>-- The queries below assume the three source tables already exist:</w:t>
+        <w:br/>
+        <w:t>--   forest_area(country_code, country_name, year, forest_area_sqkm)</w:t>
+        <w:br/>
+        <w:t>--   land_area(country_code, country_name, year, total_area_sq_mi)</w:t>
+        <w:br/>
+        <w:t>--   regions(country_name, country_code, region, income_group)</w:t>
+        <w:br/>
+        <w:br/>
+        <w:t>CREATE OR REPLACE VIEW forestation AS</w:t>
+        <w:br/>
+        <w:t>SELECT</w:t>
+        <w:br/>
+        <w:t xml:space="preserve">    fa.country_code,</w:t>
+        <w:br/>
+        <w:t xml:space="preserve">    fa.country_name,</w:t>
+        <w:br/>
+        <w:t xml:space="preserve">    fa.year,</w:t>
+        <w:br/>
+        <w:t xml:space="preserve">    fa.forest_area_sqkm,</w:t>
+        <w:br/>
+        <w:t xml:space="preserve">    la.total_area_sq_mi,</w:t>
+        <w:br/>
+        <w:t xml:space="preserve">    r.region,</w:t>
+        <w:br/>
+        <w:t xml:space="preserve">    r.income_group,</w:t>
+        <w:br/>
+        <w:t xml:space="preserve">    (fa.forest_area_sqkm / (la.total_area_sq_mi * 2.59)) * 100 AS percent_forest</w:t>
+        <w:br/>
+        <w:t>FROM forest_area AS fa</w:t>
+        <w:br/>
+        <w:t>JOIN land_area AS la</w:t>
+        <w:br/>
+        <w:t xml:space="preserve">    ON fa.country_code = la.country_code</w:t>
+        <w:br/>
+        <w:t xml:space="preserve">   AND fa.year = la.year</w:t>
+        <w:br/>
+        <w:t>JOIN regions AS r</w:t>
+        <w:br/>
+        <w:t xml:space="preserve">    ON fa.country_code = r.country_code;</w:t>
+        <w:br/>
+        <w:br/>
+        <w:t>-- 1a. World forest area in 1990</w:t>
+        <w:br/>
+        <w:t>SELECT</w:t>
+        <w:br/>
+        <w:t xml:space="preserve">    country_name,</w:t>
+        <w:br/>
+        <w:t xml:space="preserve">    year,</w:t>
+        <w:br/>
+        <w:t xml:space="preserve">    forest_area_sqkm</w:t>
+        <w:br/>
+        <w:t>FROM forestation</w:t>
+        <w:br/>
+        <w:t>WHERE country_name = 'World'</w:t>
+        <w:br/>
+        <w:t xml:space="preserve">  AND year = 1990;</w:t>
+        <w:br/>
+        <w:br/>
+        <w:t>-- 1b. World forest area in 2016</w:t>
+        <w:br/>
+        <w:t>SELECT</w:t>
+        <w:br/>
+        <w:t xml:space="preserve">    country_name,</w:t>
+        <w:br/>
+        <w:t xml:space="preserve">    year,</w:t>
+        <w:br/>
+        <w:t xml:space="preserve">    forest_area_sqkm</w:t>
+        <w:br/>
+        <w:t>FROM forestation</w:t>
+        <w:br/>
+        <w:t>WHERE country_name = 'World'</w:t>
+        <w:br/>
+        <w:t xml:space="preserve">  AND year = 2016;</w:t>
+        <w:br/>
+        <w:br/>
+        <w:t>-- 1c. Change in world forest area from 1990 to 2016</w:t>
+        <w:br/>
+        <w:t>SELECT</w:t>
+        <w:br/>
+        <w:t xml:space="preserve">    f1990.forest_area_sqkm AS forest_area_1990,</w:t>
+        <w:br/>
+        <w:t xml:space="preserve">    f2016.forest_area_sqkm AS forest_area_2016,</w:t>
+        <w:br/>
+        <w:t xml:space="preserve">    f1990.forest_area_sqkm - f2016.forest_area_sqkm AS forest_area_change_sqkm</w:t>
+        <w:br/>
+        <w:t>FROM forestation AS f1990</w:t>
+        <w:br/>
+        <w:t>JOIN forestation AS f2016</w:t>
+        <w:br/>
+        <w:t xml:space="preserve">    ON f1990.country_code = f2016.country_code</w:t>
+        <w:br/>
+        <w:t>WHERE f1990.country_name = 'World'</w:t>
+        <w:br/>
+        <w:t xml:space="preserve">  AND f1990.year = 1990</w:t>
+        <w:br/>
+        <w:t xml:space="preserve">  AND f2016.year = 2016;</w:t>
+        <w:br/>
+        <w:br/>
+        <w:t>-- 1d. Percent change in world forest area from 1990 to 2016</w:t>
+        <w:br/>
+        <w:t>SELECT</w:t>
+        <w:br/>
+        <w:t xml:space="preserve">    ROUND(</w:t>
+        <w:br/>
+        <w:t xml:space="preserve">        ((f1990.forest_area_sqkm - f2016.forest_area_sqkm) / f1990.forest_area_sqkm) * 100,</w:t>
+        <w:br/>
+        <w:t xml:space="preserve">        2</w:t>
+        <w:br/>
+        <w:t xml:space="preserve">    ) AS percent_change</w:t>
+        <w:br/>
+        <w:t>FROM forestation AS f1990</w:t>
+        <w:br/>
+        <w:t>JOIN forestation AS f2016</w:t>
+        <w:br/>
+        <w:t xml:space="preserve">    ON f1990.country_code = f2016.country_code</w:t>
+        <w:br/>
+        <w:t>WHERE f1990.country_name = 'World'</w:t>
+        <w:br/>
+        <w:t xml:space="preserve">  AND f1990.year = 1990</w:t>
+        <w:br/>
+        <w:t xml:space="preserve">  AND f2016.year = 2016;</w:t>
+        <w:br/>
+        <w:br/>
+        <w:t>-- 1e. Country whose 2016 total land area is closest to the global forest loss</w:t>
+        <w:br/>
+        <w:t>WITH world_loss AS (</w:t>
+        <w:br/>
+        <w:t xml:space="preserve">    SELECT</w:t>
+        <w:br/>
+        <w:t xml:space="preserve">        f1990.forest_area_sqkm - f2016.forest_area_sqkm AS area_lost_sqkm</w:t>
+        <w:br/>
+        <w:t xml:space="preserve">    FROM forestation AS f1990</w:t>
+        <w:br/>
+        <w:t xml:space="preserve">    JOIN forestation AS f2016</w:t>
+        <w:br/>
+        <w:t xml:space="preserve">        ON f1990.country_code = f2016.country_code</w:t>
+        <w:br/>
+        <w:t xml:space="preserve">    WHERE f1990.country_name = 'World'</w:t>
+        <w:br/>
+        <w:t xml:space="preserve">      AND f1990.year = 1990</w:t>
+        <w:br/>
+        <w:t xml:space="preserve">      AND f2016.year = 2016</w:t>
+        <w:br/>
+        <w:t>)</w:t>
+        <w:br/>
+        <w:t>SELECT</w:t>
+        <w:br/>
+        <w:t xml:space="preserve">    country_name,</w:t>
+        <w:br/>
+        <w:t xml:space="preserve">    ROUND(total_area_sq_mi * 2.59, 2) AS total_area_sqkm,</w:t>
+        <w:br/>
+        <w:t xml:space="preserve">    ROUND(ABS((total_area_sq_mi * 2.59) - area_lost_sqkm), 2) AS difference_from_loss</w:t>
+        <w:br/>
+        <w:t>FROM forestation</w:t>
+        <w:br/>
+        <w:t>CROSS JOIN world_loss</w:t>
+        <w:br/>
+        <w:t>WHERE year = 2016</w:t>
+        <w:br/>
+        <w:t xml:space="preserve">  AND country_name &lt;&gt; 'World'</w:t>
+        <w:br/>
+        <w:t>ORDER BY difference_from_loss</w:t>
+        <w:br/>
+        <w:t>LIMIT 1;</w:t>
+        <w:br/>
+        <w:br/>
+        <w:t>-- 2. Percent forest by region in 1990 and 2016</w:t>
+        <w:br/>
+        <w:t>SELECT</w:t>
+        <w:br/>
+        <w:t xml:space="preserve">    region,</w:t>
+        <w:br/>
+        <w:t xml:space="preserve">    ROUND(</w:t>
+        <w:br/>
+        <w:t xml:space="preserve">        SUM(CASE WHEN year = 1990 THEN forest_area_sqkm END)</w:t>
+        <w:br/>
+        <w:t xml:space="preserve">        / SUM(CASE WHEN year = 1990 THEN total_area_sq_mi * 2.59 END) * 100,</w:t>
+        <w:br/>
+        <w:t xml:space="preserve">        2</w:t>
+        <w:br/>
+        <w:t xml:space="preserve">    ) AS forest_percent_1990,</w:t>
+        <w:br/>
+        <w:t xml:space="preserve">    ROUND(</w:t>
+        <w:br/>
+        <w:t xml:space="preserve">        SUM(CASE WHEN year = 2016 THEN forest_area_sqkm END)</w:t>
+        <w:br/>
+        <w:t xml:space="preserve">        / SUM(CASE WHEN year = 2016 THEN total_area_sq_mi * 2.59 END) * 100,</w:t>
+        <w:br/>
+        <w:t xml:space="preserve">        2</w:t>
+        <w:br/>
+        <w:t xml:space="preserve">    ) AS forest_percent_2016</w:t>
+        <w:br/>
+        <w:t>FROM forestation</w:t>
+        <w:br/>
+        <w:t>GROUP BY region</w:t>
+        <w:br/>
+        <w:t>ORDER BY region;</w:t>
+        <w:br/>
+        <w:br/>
+        <w:t>-- 2a. Highest and lowest percent forest in 2016</w:t>
+        <w:br/>
+        <w:t>SELECT</w:t>
+        <w:br/>
+        <w:t xml:space="preserve">    region,</w:t>
+        <w:br/>
+        <w:t xml:space="preserve">    ROUND(SUM(forest_area_sqkm) / SUM(total_area_sq_mi * 2.59) * 100, 2) AS forest_percent_2016</w:t>
+        <w:br/>
+        <w:t>FROM forestation</w:t>
+        <w:br/>
+        <w:t>WHERE year = 2016</w:t>
+        <w:br/>
+        <w:t>GROUP BY region</w:t>
+        <w:br/>
+        <w:t>ORDER BY forest_percent_2016 DESC;</w:t>
+        <w:br/>
+        <w:br/>
+        <w:t>-- 2b. Highest and lowest percent forest in 1990</w:t>
+        <w:br/>
+        <w:t>SELECT</w:t>
+        <w:br/>
+        <w:t xml:space="preserve">    region,</w:t>
+        <w:br/>
+        <w:t xml:space="preserve">    ROUND(SUM(forest_area_sqkm) / SUM(total_area_sq_mi * 2.59) * 100, 2) AS forest_percent_1990</w:t>
+        <w:br/>
+        <w:t>FROM forestation</w:t>
+        <w:br/>
+        <w:t>WHERE year = 1990</w:t>
+        <w:br/>
+        <w:t>GROUP BY region</w:t>
+        <w:br/>
+        <w:t>ORDER BY forest_percent_1990 DESC;</w:t>
+        <w:br/>
+        <w:br/>
+        <w:t>-- 2c. Regions that decreased in percent forest area from 1990 to 2016</w:t>
+        <w:br/>
+        <w:t>WITH regional_1990 AS (</w:t>
+        <w:br/>
+        <w:t xml:space="preserve">    SELECT</w:t>
+        <w:br/>
+        <w:t xml:space="preserve">        region,</w:t>
+        <w:br/>
+        <w:t xml:space="preserve">        SUM(forest_area_sqkm) / SUM(total_area_sq_mi * 2.59) * 100 AS forest_percent_1990</w:t>
+        <w:br/>
+        <w:t xml:space="preserve">    FROM forestation</w:t>
+        <w:br/>
+        <w:t xml:space="preserve">    WHERE year = 1990</w:t>
+        <w:br/>
+        <w:t xml:space="preserve">    GROUP BY region</w:t>
+        <w:br/>
+        <w:t>),</w:t>
+        <w:br/>
+        <w:t>regional_2016 AS (</w:t>
+        <w:br/>
+        <w:t xml:space="preserve">    SELECT</w:t>
+        <w:br/>
+        <w:t xml:space="preserve">        region,</w:t>
+        <w:br/>
+        <w:t xml:space="preserve">        SUM(forest_area_sqkm) / SUM(total_area_sq_mi * 2.59) * 100 AS forest_percent_2016</w:t>
+        <w:br/>
+        <w:t xml:space="preserve">    FROM forestation</w:t>
+        <w:br/>
+        <w:t xml:space="preserve">    WHERE year = 2016</w:t>
+        <w:br/>
+        <w:t xml:space="preserve">    GROUP BY region</w:t>
+        <w:br/>
+        <w:t>)</w:t>
+        <w:br/>
+        <w:t>SELECT</w:t>
+        <w:br/>
+        <w:t xml:space="preserve">    r1990.region,</w:t>
+        <w:br/>
+        <w:t xml:space="preserve">    ROUND(r1990.forest_percent_1990, 2) AS forest_percent_1990,</w:t>
+        <w:br/>
+        <w:t xml:space="preserve">    ROUND(r2016.forest_percent_2016, 2) AS forest_percent_2016</w:t>
+        <w:br/>
+        <w:t>FROM regional_1990 AS r1990</w:t>
+        <w:br/>
+        <w:t>JOIN regional_2016 AS r2016</w:t>
+        <w:br/>
+        <w:t xml:space="preserve">    ON r1990.region = r2016.region</w:t>
+        <w:br/>
+        <w:t>WHERE r2016.forest_percent_2016 &lt; r1990.forest_percent_1990</w:t>
+        <w:br/>
+        <w:t xml:space="preserve">  AND r1990.region &lt;&gt; 'World'</w:t>
+        <w:br/>
+        <w:t>ORDER BY forest_percent_1990 - forest_percent_2016 DESC;</w:t>
+        <w:br/>
+        <w:br/>
+        <w:t>-- 3a. Top 5 countries with the largest decrease in forest area</w:t>
+        <w:br/>
+        <w:t>WITH country_changes AS (</w:t>
+        <w:br/>
+        <w:t xml:space="preserve">    SELECT</w:t>
+        <w:br/>
+        <w:t xml:space="preserve">        f1990.country_name,</w:t>
+        <w:br/>
+        <w:t xml:space="preserve">        f1990.region,</w:t>
+        <w:br/>
+        <w:t xml:space="preserve">        f1990.forest_area_sqkm AS forest_area_1990,</w:t>
+        <w:br/>
+        <w:t xml:space="preserve">        f2016.forest_area_sqkm AS forest_area_2016,</w:t>
+        <w:br/>
+        <w:t xml:space="preserve">        f1990.forest_area_sqkm - f2016.forest_area_sqkm AS decrease_sqkm,</w:t>
+        <w:br/>
+        <w:t xml:space="preserve">        ROW_NUMBER() OVER (</w:t>
+        <w:br/>
+        <w:t xml:space="preserve">            ORDER BY f1990.forest_area_sqkm - f2016.forest_area_sqkm DESC, f1990.country_name</w:t>
+        <w:br/>
+        <w:t xml:space="preserve">        ) AS amount_rank</w:t>
+        <w:br/>
+        <w:t xml:space="preserve">    FROM forestation AS f1990</w:t>
+        <w:br/>
+        <w:t xml:space="preserve">    JOIN forestation AS f2016</w:t>
+        <w:br/>
+        <w:t xml:space="preserve">        ON f1990.country_code = f2016.country_code</w:t>
+        <w:br/>
+        <w:t xml:space="preserve">    WHERE f1990.year = 1990</w:t>
+        <w:br/>
+        <w:t xml:space="preserve">      AND f2016.year = 2016</w:t>
+        <w:br/>
+        <w:t xml:space="preserve">      AND f1990.country_name &lt;&gt; 'World'</w:t>
+        <w:br/>
+        <w:t>)</w:t>
+        <w:br/>
+        <w:t>SELECT</w:t>
+        <w:br/>
+        <w:t xml:space="preserve">    country_name,</w:t>
+        <w:br/>
+        <w:t xml:space="preserve">    region,</w:t>
+        <w:br/>
+        <w:t xml:space="preserve">    ROUND(decrease_sqkm, 2) AS decrease_sqkm</w:t>
+        <w:br/>
+        <w:t>FROM country_changes</w:t>
+        <w:br/>
+        <w:t>WHERE amount_rank &lt;= 5</w:t>
+        <w:br/>
+        <w:t>ORDER BY amount_rank;</w:t>
+        <w:br/>
+        <w:br/>
+        <w:t>-- 3b. Top 5 countries with the largest percent decrease in forest area</w:t>
+        <w:br/>
+        <w:t>WITH country_percent_changes AS (</w:t>
+        <w:br/>
+        <w:t xml:space="preserve">    SELECT</w:t>
+        <w:br/>
+        <w:t xml:space="preserve">        f1990.country_name,</w:t>
+        <w:br/>
+        <w:t xml:space="preserve">        f1990.region,</w:t>
+        <w:br/>
+        <w:t xml:space="preserve">        ROUND(</w:t>
+        <w:br/>
+        <w:t xml:space="preserve">            ((f1990.forest_area_sqkm - f2016.forest_area_sqkm) / f1990.forest_area_sqkm) * 100,</w:t>
+        <w:br/>
+        <w:t xml:space="preserve">            2</w:t>
+        <w:br/>
+        <w:t xml:space="preserve">        ) AS percent_decrease,</w:t>
+        <w:br/>
+        <w:t xml:space="preserve">        ROW_NUMBER() OVER (</w:t>
+        <w:br/>
+        <w:t xml:space="preserve">            ORDER BY ((f1990.forest_area_sqkm - f2016.forest_area_sqkm) / f1990.forest_area_sqkm) DESC,</w:t>
+        <w:br/>
+        <w:t xml:space="preserve">                     f1990.country_name</w:t>
+        <w:br/>
+        <w:t xml:space="preserve">        ) AS percent_rank</w:t>
+        <w:br/>
+        <w:t xml:space="preserve">    FROM forestation AS f1990</w:t>
+        <w:br/>
+        <w:t xml:space="preserve">    JOIN forestation AS f2016</w:t>
+        <w:br/>
+        <w:t xml:space="preserve">        ON f1990.country_code = f2016.country_code</w:t>
+        <w:br/>
+        <w:t xml:space="preserve">    WHERE f1990.year = 1990</w:t>
+        <w:br/>
+        <w:t xml:space="preserve">      AND f2016.year = 2016</w:t>
+        <w:br/>
+        <w:t xml:space="preserve">      AND f1990.country_name &lt;&gt; 'World'</w:t>
+        <w:br/>
+        <w:t xml:space="preserve">      AND f1990.forest_area_sqkm &gt; 0</w:t>
+        <w:br/>
+        <w:t>)</w:t>
+        <w:br/>
+        <w:t>SELECT</w:t>
+        <w:br/>
+        <w:t xml:space="preserve">    country_name,</w:t>
+        <w:br/>
+        <w:t xml:space="preserve">    region,</w:t>
+        <w:br/>
+        <w:t xml:space="preserve">    percent_decrease</w:t>
+        <w:br/>
+        <w:t>FROM country_percent_changes</w:t>
+        <w:br/>
+        <w:t>WHERE percent_rank &lt;= 5</w:t>
+        <w:br/>
+        <w:t>ORDER BY percent_rank;</w:t>
+        <w:br/>
+        <w:br/>
+        <w:t>-- 3c. Countries grouped by 2016 forestation quartile bands</w:t>
+        <w:br/>
+        <w:t>SELECT</w:t>
+        <w:br/>
+        <w:t xml:space="preserve">    CASE</w:t>
+        <w:br/>
+        <w:t xml:space="preserve">        WHEN percent_forest &lt;= 25 THEN '1st quartile (0% to 25%)'</w:t>
+        <w:br/>
+        <w:t xml:space="preserve">        WHEN percent_forest &lt;= 50 THEN '2nd quartile (25% to 50%)'</w:t>
+        <w:br/>
+        <w:t xml:space="preserve">        WHEN percent_forest &lt;= 75 THEN '3rd quartile (50% to 75%)'</w:t>
+        <w:br/>
+        <w:t xml:space="preserve">        ELSE '4th quartile (greater than 75%)'</w:t>
+        <w:br/>
+        <w:t xml:space="preserve">    END AS forest_quartile,</w:t>
+        <w:br/>
+        <w:t xml:space="preserve">    COUNT(*) AS country_count</w:t>
+        <w:br/>
+        <w:t>FROM forestation</w:t>
+        <w:br/>
+        <w:t>WHERE year = 2016</w:t>
+        <w:br/>
+        <w:t xml:space="preserve">  AND country_name &lt;&gt; 'World'</w:t>
+        <w:br/>
+        <w:t xml:space="preserve">  AND percent_forest IS NOT NULL</w:t>
+        <w:br/>
+        <w:t>GROUP BY forest_quartile</w:t>
+        <w:br/>
+        <w:t>ORDER BY country_count DESC;</w:t>
+        <w:br/>
+        <w:br/>
+        <w:t>-- 3d. Countries in the 4th quartile in 2016</w:t>
+        <w:br/>
+        <w:t>SELECT</w:t>
+        <w:br/>
+        <w:t xml:space="preserve">    country_name,</w:t>
+        <w:br/>
+        <w:t xml:space="preserve">    region,</w:t>
+        <w:br/>
+        <w:t xml:space="preserve">    ROUND(percent_forest, 2) AS percent_forest</w:t>
+        <w:br/>
+        <w:t>FROM forestation</w:t>
+        <w:br/>
+        <w:t>WHERE year = 2016</w:t>
+        <w:br/>
+        <w:t xml:space="preserve">  AND country_name &lt;&gt; 'World'</w:t>
+        <w:br/>
+        <w:t xml:space="preserve">  AND percent_forest &gt; 75</w:t>
+        <w:br/>
+        <w:t>ORDER BY percent_forest DESC, country_name;</w:t>
+        <w:br/>
+        <w:br/>
+        <w:t>-- 3e. Number of countries with higher forestation than the United States in 2016</w:t>
+        <w:br/>
+        <w:t>SELECT</w:t>
+        <w:br/>
+        <w:t xml:space="preserve">    COUNT(*) AS countries_above_united_states</w:t>
+        <w:br/>
+        <w:t>FROM forestation</w:t>
+        <w:br/>
+        <w:t>WHERE year = 2016</w:t>
+        <w:br/>
+        <w:t xml:space="preserve">  AND country_name &lt;&gt; 'World'</w:t>
+        <w:br/>
+        <w:t xml:space="preserve">  AND percent_forest &gt; (</w:t>
+        <w:br/>
+        <w:t xml:space="preserve">      SELECT percent_forest</w:t>
+        <w:br/>
+        <w:t xml:space="preserve">      FROM forestation</w:t>
+        <w:br/>
+        <w:t xml:space="preserve">      WHERE country_name = 'United States'</w:t>
+        <w:br/>
+        <w:t xml:space="preserve">        AND year = 2016</w:t>
+        <w:br/>
+        <w:t xml:space="preserve">  );</w:t>
       </w:r>
     </w:p>
     <w:sectPr>

</xml_diff>